<commit_message>
CAT folio: task 1 is objects and family, so stories sit only in task 3
Co-Authored-By: Claude Fable 5.1 <noreply@anthropic.com>
Claude-Session: https://claude.ai/code/session_01TX2KYiJGekMNoBBPASQh6e
</commit_message>
<xml_diff>
--- a/BoneSparrow-CAT-folio-grammar.docx
+++ b/BoneSparrow-CAT-folio-grammar.docx
@@ -794,7 +794,7 @@
                 <w:sz w:val="24"/>
                 <w:szCs w:val="24"/>
               </w:rPr>
-              <w:t xml:space="preserve"> show that stories and objects help the characters hold on to who they are in </w:t>
+              <w:t xml:space="preserve"> show that the objects the characters keep help them hold on to who they are in </w:t>
             </w:r>
             <w:r>
               <w:rPr>
@@ -853,7 +853,7 @@
                 <w:i/>
                 <w:iCs/>
               </w:rPr>
-              <w:t xml:space="preserve"> You might also think about Jimmie’s book, Maá’s stories or Eli’s whale.</w:t>
+              <w:t xml:space="preserve"> You might also think about Subhi’s treasures, Jimmie’s necklace, or the family around Subhi.</w:t>
             </w:r>
           </w:p>
         </w:tc>

</xml_diff>

<commit_message>
CAT folio: paragraph 2 fits one page
Co-Authored-By: Claude Fable 5.1 <noreply@anthropic.com>
Claude-Session: https://claude.ai/code/session_01TX2KYiJGekMNoBBPASQh6e
</commit_message>
<xml_diff>
--- a/BoneSparrow-CAT-folio-grammar.docx
+++ b/BoneSparrow-CAT-folio-grammar.docx
@@ -2607,36 +2607,6 @@
                 </w:p>
               </w:tc>
             </w:tr>
-            <w:tr>
-              <w:trPr>
-                <w:trHeight w:val="520" w:hRule="exact"/>
-              </w:trPr>
-              <w:tc>
-                <w:tcPr>
-                  <w:tcW w:type="dxa" w:w="7846"/>
-                  <w:tcMar>
-                    <w:top w:type="dxa" w:w="0"/>
-                    <w:left w:type="dxa" w:w="0"/>
-                    <w:bottom w:type="dxa" w:w="0"/>
-                    <w:right w:type="dxa" w:w="0"/>
-                  </w:tcMar>
-                </w:tcPr>
-                <w:p>
-                  <w:pPr>
-                    <w:spacing w:after="0"/>
-                  </w:pPr>
-                  <w:r>
-                    <w:rPr>
-                      <w:rFonts w:ascii="Aptos Narrow" w:cs="Aptos Narrow" w:eastAsia="Aptos Narrow" w:hAnsi="Aptos Narrow"/>
-                      <w:color w:val="000000"/>
-                      <w:sz w:val="22"/>
-                      <w:szCs w:val="22"/>
-                    </w:rPr>
-                    <w:t xml:space="preserve"/>
-                  </w:r>
-                </w:p>
-              </w:tc>
-            </w:tr>
           </w:tbl>
           <w:p/>
         </w:tc>
@@ -2861,36 +2831,6 @@
                 </w:p>
               </w:tc>
             </w:tr>
-            <w:tr>
-              <w:trPr>
-                <w:trHeight w:val="520" w:hRule="exact"/>
-              </w:trPr>
-              <w:tc>
-                <w:tcPr>
-                  <w:tcW w:type="dxa" w:w="7846"/>
-                  <w:tcMar>
-                    <w:top w:type="dxa" w:w="0"/>
-                    <w:left w:type="dxa" w:w="0"/>
-                    <w:bottom w:type="dxa" w:w="0"/>
-                    <w:right w:type="dxa" w:w="0"/>
-                  </w:tcMar>
-                </w:tcPr>
-                <w:p>
-                  <w:pPr>
-                    <w:spacing w:after="0"/>
-                  </w:pPr>
-                  <w:r>
-                    <w:rPr>
-                      <w:rFonts w:ascii="Aptos Narrow" w:cs="Aptos Narrow" w:eastAsia="Aptos Narrow" w:hAnsi="Aptos Narrow"/>
-                      <w:color w:val="000000"/>
-                      <w:sz w:val="22"/>
-                      <w:szCs w:val="22"/>
-                    </w:rPr>
-                    <w:t xml:space="preserve"/>
-                  </w:r>
-                </w:p>
-              </w:tc>
-            </w:tr>
           </w:tbl>
           <w:p/>
         </w:tc>
@@ -3085,36 +3025,6 @@
                 </w:p>
               </w:tc>
             </w:tr>
-            <w:tr>
-              <w:trPr>
-                <w:trHeight w:val="520" w:hRule="exact"/>
-              </w:trPr>
-              <w:tc>
-                <w:tcPr>
-                  <w:tcW w:type="dxa" w:w="7846"/>
-                  <w:tcMar>
-                    <w:top w:type="dxa" w:w="0"/>
-                    <w:left w:type="dxa" w:w="0"/>
-                    <w:bottom w:type="dxa" w:w="0"/>
-                    <w:right w:type="dxa" w:w="0"/>
-                  </w:tcMar>
-                </w:tcPr>
-                <w:p>
-                  <w:pPr>
-                    <w:spacing w:after="0"/>
-                  </w:pPr>
-                  <w:r>
-                    <w:rPr>
-                      <w:rFonts w:ascii="Aptos Narrow" w:cs="Aptos Narrow" w:eastAsia="Aptos Narrow" w:hAnsi="Aptos Narrow"/>
-                      <w:color w:val="000000"/>
-                      <w:sz w:val="22"/>
-                      <w:szCs w:val="22"/>
-                    </w:rPr>
-                    <w:t xml:space="preserve"/>
-                  </w:r>
-                </w:p>
-              </w:tc>
-            </w:tr>
           </w:tbl>
           <w:p/>
         </w:tc>
@@ -3189,36 +3099,6 @@
             <w:tblGrid>
               <w:gridCol w:w="7846"/>
             </w:tblGrid>
-            <w:tr>
-              <w:trPr>
-                <w:trHeight w:val="520" w:hRule="exact"/>
-              </w:trPr>
-              <w:tc>
-                <w:tcPr>
-                  <w:tcW w:type="dxa" w:w="7846"/>
-                  <w:tcMar>
-                    <w:top w:type="dxa" w:w="0"/>
-                    <w:left w:type="dxa" w:w="0"/>
-                    <w:bottom w:type="dxa" w:w="0"/>
-                    <w:right w:type="dxa" w:w="0"/>
-                  </w:tcMar>
-                </w:tcPr>
-                <w:p>
-                  <w:pPr>
-                    <w:spacing w:after="0"/>
-                  </w:pPr>
-                  <w:r>
-                    <w:rPr>
-                      <w:rFonts w:ascii="Aptos Narrow" w:cs="Aptos Narrow" w:eastAsia="Aptos Narrow" w:hAnsi="Aptos Narrow"/>
-                      <w:color w:val="000000"/>
-                      <w:sz w:val="22"/>
-                      <w:szCs w:val="22"/>
-                    </w:rPr>
-                    <w:t xml:space="preserve"/>
-                  </w:r>
-                </w:p>
-              </w:tc>
-            </w:tr>
             <w:tr>
               <w:trPr>
                 <w:trHeight w:val="520" w:hRule="exact"/>
@@ -6791,36 +6671,6 @@
                 </w:p>
               </w:tc>
             </w:tr>
-            <w:tr>
-              <w:trPr>
-                <w:trHeight w:val="520" w:hRule="exact"/>
-              </w:trPr>
-              <w:tc>
-                <w:tcPr>
-                  <w:tcW w:type="dxa" w:w="7846"/>
-                  <w:tcMar>
-                    <w:top w:type="dxa" w:w="0"/>
-                    <w:left w:type="dxa" w:w="0"/>
-                    <w:bottom w:type="dxa" w:w="0"/>
-                    <w:right w:type="dxa" w:w="0"/>
-                  </w:tcMar>
-                </w:tcPr>
-                <w:p>
-                  <w:pPr>
-                    <w:spacing w:after="0"/>
-                  </w:pPr>
-                  <w:r>
-                    <w:rPr>
-                      <w:rFonts w:ascii="Aptos Narrow" w:cs="Aptos Narrow" w:eastAsia="Aptos Narrow" w:hAnsi="Aptos Narrow"/>
-                      <w:color w:val="000000"/>
-                      <w:sz w:val="22"/>
-                      <w:szCs w:val="22"/>
-                    </w:rPr>
-                    <w:t xml:space="preserve"/>
-                  </w:r>
-                </w:p>
-              </w:tc>
-            </w:tr>
           </w:tbl>
           <w:p/>
         </w:tc>
@@ -7029,36 +6879,6 @@
                 </w:p>
               </w:tc>
             </w:tr>
-            <w:tr>
-              <w:trPr>
-                <w:trHeight w:val="520" w:hRule="exact"/>
-              </w:trPr>
-              <w:tc>
-                <w:tcPr>
-                  <w:tcW w:type="dxa" w:w="7846"/>
-                  <w:tcMar>
-                    <w:top w:type="dxa" w:w="0"/>
-                    <w:left w:type="dxa" w:w="0"/>
-                    <w:bottom w:type="dxa" w:w="0"/>
-                    <w:right w:type="dxa" w:w="0"/>
-                  </w:tcMar>
-                </w:tcPr>
-                <w:p>
-                  <w:pPr>
-                    <w:spacing w:after="0"/>
-                  </w:pPr>
-                  <w:r>
-                    <w:rPr>
-                      <w:rFonts w:ascii="Aptos Narrow" w:cs="Aptos Narrow" w:eastAsia="Aptos Narrow" w:hAnsi="Aptos Narrow"/>
-                      <w:color w:val="000000"/>
-                      <w:sz w:val="22"/>
-                      <w:szCs w:val="22"/>
-                    </w:rPr>
-                    <w:t xml:space="preserve"/>
-                  </w:r>
-                </w:p>
-              </w:tc>
-            </w:tr>
           </w:tbl>
           <w:p/>
         </w:tc>
@@ -7253,36 +7073,6 @@
                 </w:p>
               </w:tc>
             </w:tr>
-            <w:tr>
-              <w:trPr>
-                <w:trHeight w:val="520" w:hRule="exact"/>
-              </w:trPr>
-              <w:tc>
-                <w:tcPr>
-                  <w:tcW w:type="dxa" w:w="7846"/>
-                  <w:tcMar>
-                    <w:top w:type="dxa" w:w="0"/>
-                    <w:left w:type="dxa" w:w="0"/>
-                    <w:bottom w:type="dxa" w:w="0"/>
-                    <w:right w:type="dxa" w:w="0"/>
-                  </w:tcMar>
-                </w:tcPr>
-                <w:p>
-                  <w:pPr>
-                    <w:spacing w:after="0"/>
-                  </w:pPr>
-                  <w:r>
-                    <w:rPr>
-                      <w:rFonts w:ascii="Aptos Narrow" w:cs="Aptos Narrow" w:eastAsia="Aptos Narrow" w:hAnsi="Aptos Narrow"/>
-                      <w:color w:val="000000"/>
-                      <w:sz w:val="22"/>
-                      <w:szCs w:val="22"/>
-                    </w:rPr>
-                    <w:t xml:space="preserve"/>
-                  </w:r>
-                </w:p>
-              </w:tc>
-            </w:tr>
           </w:tbl>
           <w:p/>
         </w:tc>
@@ -7341,36 +7131,6 @@
             <w:tblGrid>
               <w:gridCol w:w="7846"/>
             </w:tblGrid>
-            <w:tr>
-              <w:trPr>
-                <w:trHeight w:val="520" w:hRule="exact"/>
-              </w:trPr>
-              <w:tc>
-                <w:tcPr>
-                  <w:tcW w:type="dxa" w:w="7846"/>
-                  <w:tcMar>
-                    <w:top w:type="dxa" w:w="0"/>
-                    <w:left w:type="dxa" w:w="0"/>
-                    <w:bottom w:type="dxa" w:w="0"/>
-                    <w:right w:type="dxa" w:w="0"/>
-                  </w:tcMar>
-                </w:tcPr>
-                <w:p>
-                  <w:pPr>
-                    <w:spacing w:after="0"/>
-                  </w:pPr>
-                  <w:r>
-                    <w:rPr>
-                      <w:rFonts w:ascii="Aptos Narrow" w:cs="Aptos Narrow" w:eastAsia="Aptos Narrow" w:hAnsi="Aptos Narrow"/>
-                      <w:color w:val="000000"/>
-                      <w:sz w:val="22"/>
-                      <w:szCs w:val="22"/>
-                    </w:rPr>
-                    <w:t xml:space="preserve"/>
-                  </w:r>
-                </w:p>
-              </w:tc>
-            </w:tr>
             <w:tr>
               <w:trPr>
                 <w:trHeight w:val="520" w:hRule="exact"/>
@@ -10974,36 +10734,6 @@
                 </w:p>
               </w:tc>
             </w:tr>
-            <w:tr>
-              <w:trPr>
-                <w:trHeight w:val="520" w:hRule="exact"/>
-              </w:trPr>
-              <w:tc>
-                <w:tcPr>
-                  <w:tcW w:type="dxa" w:w="7846"/>
-                  <w:tcMar>
-                    <w:top w:type="dxa" w:w="0"/>
-                    <w:left w:type="dxa" w:w="0"/>
-                    <w:bottom w:type="dxa" w:w="0"/>
-                    <w:right w:type="dxa" w:w="0"/>
-                  </w:tcMar>
-                </w:tcPr>
-                <w:p>
-                  <w:pPr>
-                    <w:spacing w:after="0"/>
-                  </w:pPr>
-                  <w:r>
-                    <w:rPr>
-                      <w:rFonts w:ascii="Aptos Narrow" w:cs="Aptos Narrow" w:eastAsia="Aptos Narrow" w:hAnsi="Aptos Narrow"/>
-                      <w:color w:val="000000"/>
-                      <w:sz w:val="22"/>
-                      <w:szCs w:val="22"/>
-                    </w:rPr>
-                    <w:t xml:space="preserve"/>
-                  </w:r>
-                </w:p>
-              </w:tc>
-            </w:tr>
           </w:tbl>
           <w:p/>
         </w:tc>
@@ -11212,36 +10942,6 @@
                 </w:p>
               </w:tc>
             </w:tr>
-            <w:tr>
-              <w:trPr>
-                <w:trHeight w:val="520" w:hRule="exact"/>
-              </w:trPr>
-              <w:tc>
-                <w:tcPr>
-                  <w:tcW w:type="dxa" w:w="7846"/>
-                  <w:tcMar>
-                    <w:top w:type="dxa" w:w="0"/>
-                    <w:left w:type="dxa" w:w="0"/>
-                    <w:bottom w:type="dxa" w:w="0"/>
-                    <w:right w:type="dxa" w:w="0"/>
-                  </w:tcMar>
-                </w:tcPr>
-                <w:p>
-                  <w:pPr>
-                    <w:spacing w:after="0"/>
-                  </w:pPr>
-                  <w:r>
-                    <w:rPr>
-                      <w:rFonts w:ascii="Aptos Narrow" w:cs="Aptos Narrow" w:eastAsia="Aptos Narrow" w:hAnsi="Aptos Narrow"/>
-                      <w:color w:val="000000"/>
-                      <w:sz w:val="22"/>
-                      <w:szCs w:val="22"/>
-                    </w:rPr>
-                    <w:t xml:space="preserve"/>
-                  </w:r>
-                </w:p>
-              </w:tc>
-            </w:tr>
           </w:tbl>
           <w:p/>
         </w:tc>
@@ -11436,36 +11136,6 @@
                 </w:p>
               </w:tc>
             </w:tr>
-            <w:tr>
-              <w:trPr>
-                <w:trHeight w:val="520" w:hRule="exact"/>
-              </w:trPr>
-              <w:tc>
-                <w:tcPr>
-                  <w:tcW w:type="dxa" w:w="7846"/>
-                  <w:tcMar>
-                    <w:top w:type="dxa" w:w="0"/>
-                    <w:left w:type="dxa" w:w="0"/>
-                    <w:bottom w:type="dxa" w:w="0"/>
-                    <w:right w:type="dxa" w:w="0"/>
-                  </w:tcMar>
-                </w:tcPr>
-                <w:p>
-                  <w:pPr>
-                    <w:spacing w:after="0"/>
-                  </w:pPr>
-                  <w:r>
-                    <w:rPr>
-                      <w:rFonts w:ascii="Aptos Narrow" w:cs="Aptos Narrow" w:eastAsia="Aptos Narrow" w:hAnsi="Aptos Narrow"/>
-                      <w:color w:val="000000"/>
-                      <w:sz w:val="22"/>
-                      <w:szCs w:val="22"/>
-                    </w:rPr>
-                    <w:t xml:space="preserve"/>
-                  </w:r>
-                </w:p>
-              </w:tc>
-            </w:tr>
           </w:tbl>
           <w:p/>
         </w:tc>
@@ -11524,36 +11194,6 @@
             <w:tblGrid>
               <w:gridCol w:w="7846"/>
             </w:tblGrid>
-            <w:tr>
-              <w:trPr>
-                <w:trHeight w:val="520" w:hRule="exact"/>
-              </w:trPr>
-              <w:tc>
-                <w:tcPr>
-                  <w:tcW w:type="dxa" w:w="7846"/>
-                  <w:tcMar>
-                    <w:top w:type="dxa" w:w="0"/>
-                    <w:left w:type="dxa" w:w="0"/>
-                    <w:bottom w:type="dxa" w:w="0"/>
-                    <w:right w:type="dxa" w:w="0"/>
-                  </w:tcMar>
-                </w:tcPr>
-                <w:p>
-                  <w:pPr>
-                    <w:spacing w:after="0"/>
-                  </w:pPr>
-                  <w:r>
-                    <w:rPr>
-                      <w:rFonts w:ascii="Aptos Narrow" w:cs="Aptos Narrow" w:eastAsia="Aptos Narrow" w:hAnsi="Aptos Narrow"/>
-                      <w:color w:val="000000"/>
-                      <w:sz w:val="22"/>
-                      <w:szCs w:val="22"/>
-                    </w:rPr>
-                    <w:t xml:space="preserve"/>
-                  </w:r>
-                </w:p>
-              </w:tc>
-            </w:tr>
             <w:tr>
               <w:trPr>
                 <w:trHeight w:val="520" w:hRule="exact"/>

</xml_diff>

<commit_message>
CAT folio: paragraph 3 note points at the third idea in the introduction
Co-Authored-By: Claude Fable 5.1 <noreply@anthropic.com>
Claude-Session: https://claude.ai/code/session_01TX2KYiJGekMNoBBPASQh6e
</commit_message>
<xml_diff>
--- a/BoneSparrow-CAT-folio-grammar.docx
+++ b/BoneSparrow-CAT-folio-grammar.docx
@@ -3229,7 +3229,7 @@
           <w:sz w:val="18"/>
           <w:szCs w:val="18"/>
         </w:rPr>
-        <w:t xml:space="preserve">Stretch yourself: a third paragraph, on the idea you did not choose.</w:t>
+        <w:t xml:space="preserve">Stretch yourself: the idea you wrote third in your introduction.</w:t>
       </w:r>
     </w:p>
     <w:tbl>
@@ -7261,7 +7261,7 @@
           <w:sz w:val="18"/>
           <w:szCs w:val="18"/>
         </w:rPr>
-        <w:t xml:space="preserve">Stretch yourself: a third paragraph, on the idea you did not choose.</w:t>
+        <w:t xml:space="preserve">Stretch yourself: the idea you wrote third in your introduction.</w:t>
       </w:r>
     </w:p>
     <w:tbl>
@@ -11324,7 +11324,7 @@
           <w:sz w:val="18"/>
           <w:szCs w:val="18"/>
         </w:rPr>
-        <w:t xml:space="preserve">Stretch yourself: a third paragraph, on the idea you did not choose.</w:t>
+        <w:t xml:space="preserve">Stretch yourself: the idea you wrote third in your introduction.</w:t>
       </w:r>
     </w:p>
     <w:tbl>

</xml_diff>